<commit_message>
Fri Mar 20 04:30:36 PM CST 2026
</commit_message>
<xml_diff>
--- a/complex/01_project1639/order_material/project-1639转录组诊断+单细胞方案.docx
+++ b/complex/01_project1639/order_material/project-1639转录组诊断+单细胞方案.docx
@@ -294,8 +294,8 @@
           <w:lang w:val="en-US" w:eastAsia="zh-CN"/>
         </w:rPr>
         <w:sectPr>
-          <w:headerReference r:id="rId6" w:type="first"/>
-          <w:headerReference r:id="rId5" w:type="default"/>
+          <w:headerReference r:id="rId8" w:type="first"/>
+          <w:headerReference r:id="rId7" w:type="default"/>
           <w:pgSz w:w="11906" w:h="16838"/>
           <w:pgMar w:top="1440" w:right="1800" w:bottom="1440" w:left="1800" w:header="851" w:footer="992" w:gutter="0"/>
           <w:pgNumType w:start="1"/>
@@ -1676,10 +1676,10 @@
                     </pic:cNvPicPr>
                   </pic:nvPicPr>
                   <pic:blipFill>
-                    <a:blip r:embed="rId10">
+                    <a:blip r:embed="rId12">
                       <a:extLst>
                         <a:ext uri="{96DAC541-7B7A-43D3-8B79-37D633B846F1}">
-                          <asvg:svgBlip xmlns:asvg="http://schemas.microsoft.com/office/drawing/2016/SVG/main" r:embed="rId11"/>
+                          <asvg:svgBlip xmlns:asvg="http://schemas.microsoft.com/office/drawing/2016/SVG/main" r:embed="rId13"/>
                         </a:ext>
                       </a:extLst>
                     </a:blip>
@@ -2524,7 +2524,7 @@
                     </pic:cNvPicPr>
                   </pic:nvPicPr>
                   <pic:blipFill>
-                    <a:blip r:embed="rId12"/>
+                    <a:blip r:embed="rId14"/>
                     <a:stretch>
                       <a:fillRect/>
                     </a:stretch>
@@ -2569,7 +2569,7 @@
                     </pic:cNvPicPr>
                   </pic:nvPicPr>
                   <pic:blipFill>
-                    <a:blip r:embed="rId13">
+                    <a:blip r:embed="rId15">
                       <a:extLst>
                         <a:ext uri="{28A0092B-C50C-407E-A947-70E740481C1C}">
                           <a14:useLocalDpi xmlns:a14="http://schemas.microsoft.com/office/drawing/2010/main" val="0"/>
@@ -2700,7 +2700,7 @@
                     </pic:cNvPicPr>
                   </pic:nvPicPr>
                   <pic:blipFill>
-                    <a:blip r:embed="rId12"/>
+                    <a:blip r:embed="rId14"/>
                     <a:stretch>
                       <a:fillRect/>
                     </a:stretch>
@@ -2745,7 +2745,7 @@
                     </pic:cNvPicPr>
                   </pic:nvPicPr>
                   <pic:blipFill>
-                    <a:blip r:embed="rId13">
+                    <a:blip r:embed="rId15">
                       <a:extLst>
                         <a:ext uri="{28A0092B-C50C-407E-A947-70E740481C1C}">
                           <a14:useLocalDpi xmlns:a14="http://schemas.microsoft.com/office/drawing/2010/main" val="0"/>
@@ -3016,7 +3016,7 @@
                     </pic:cNvPicPr>
                   </pic:nvPicPr>
                   <pic:blipFill>
-                    <a:blip r:embed="rId14" cstate="print">
+                    <a:blip r:embed="rId16" cstate="print">
                       <a:extLst>
                         <a:ext uri="{28A0092B-C50C-407E-A947-70E740481C1C}">
                           <a14:useLocalDpi xmlns:a14="http://schemas.microsoft.com/office/drawing/2010/main" val="0"/>
@@ -3120,7 +3120,7 @@
                     </pic:cNvPicPr>
                   </pic:nvPicPr>
                   <pic:blipFill>
-                    <a:blip r:embed="rId15" cstate="print">
+                    <a:blip r:embed="rId17" cstate="print">
                       <a:extLst>
                         <a:ext uri="{28A0092B-C50C-407E-A947-70E740481C1C}">
                           <a14:useLocalDpi xmlns:a14="http://schemas.microsoft.com/office/drawing/2010/main" val="0"/>
@@ -3287,7 +3287,7 @@
                     </pic:cNvPicPr>
                   </pic:nvPicPr>
                   <pic:blipFill>
-                    <a:blip r:embed="rId16" cstate="print">
+                    <a:blip r:embed="rId18" cstate="print">
                       <a:extLst>
                         <a:ext uri="{28A0092B-C50C-407E-A947-70E740481C1C}">
                           <a14:useLocalDpi xmlns:a14="http://schemas.microsoft.com/office/drawing/2010/main" val="0"/>
@@ -3545,7 +3545,7 @@
                     </pic:cNvPicPr>
                   </pic:nvPicPr>
                   <pic:blipFill>
-                    <a:blip r:embed="rId17"/>
+                    <a:blip r:embed="rId19"/>
                     <a:stretch>
                       <a:fillRect/>
                     </a:stretch>
@@ -3822,7 +3822,7 @@
                     </pic:cNvPicPr>
                   </pic:nvPicPr>
                   <pic:blipFill>
-                    <a:blip r:embed="rId18"/>
+                    <a:blip r:embed="rId20"/>
                     <a:srcRect t="5946" b="3778"/>
                     <a:stretch>
                       <a:fillRect/>
@@ -4103,7 +4103,7 @@
                     </pic:cNvPicPr>
                   </pic:nvPicPr>
                   <pic:blipFill>
-                    <a:blip r:embed="rId19" cstate="print">
+                    <a:blip r:embed="rId21" cstate="print">
                       <a:extLst>
                         <a:ext uri="{28A0092B-C50C-407E-A947-70E740481C1C}">
                           <a14:useLocalDpi xmlns:a14="http://schemas.microsoft.com/office/drawing/2010/main" val="0"/>
@@ -4198,7 +4198,7 @@
                     </pic:cNvPicPr>
                   </pic:nvPicPr>
                   <pic:blipFill>
-                    <a:blip r:embed="rId20"/>
+                    <a:blip r:embed="rId22"/>
                     <a:stretch>
                       <a:fillRect/>
                     </a:stretch>
@@ -4286,7 +4286,7 @@
                     </pic:cNvPicPr>
                   </pic:nvPicPr>
                   <pic:blipFill>
-                    <a:blip r:embed="rId21" cstate="print">
+                    <a:blip r:embed="rId23" cstate="print">
                       <a:extLst>
                         <a:ext uri="{28A0092B-C50C-407E-A947-70E740481C1C}">
                           <a14:useLocalDpi xmlns:a14="http://schemas.microsoft.com/office/drawing/2010/main" val="0"/>
@@ -4381,7 +4381,7 @@
                     </pic:cNvPicPr>
                   </pic:nvPicPr>
                   <pic:blipFill>
-                    <a:blip r:embed="rId22" cstate="print">
+                    <a:blip r:embed="rId24" cstate="print">
                       <a:extLst>
                         <a:ext uri="{28A0092B-C50C-407E-A947-70E740481C1C}">
                           <a14:useLocalDpi xmlns:a14="http://schemas.microsoft.com/office/drawing/2010/main" val="0"/>
@@ -4597,7 +4597,7 @@
                     </pic:cNvPicPr>
                   </pic:nvPicPr>
                   <pic:blipFill>
-                    <a:blip r:embed="rId23"/>
+                    <a:blip r:embed="rId25"/>
                     <a:stretch>
                       <a:fillRect/>
                     </a:stretch>
@@ -4784,6 +4784,18 @@
       </w:pPr>
       <w:r>
         <w:rPr>
+          <w:rFonts w:hint="default" w:cs="Times New Roman"/>
+          <w:b/>
+          <w:bCs/>
+          <w:kern w:val="0"/>
+          <w:sz w:val="24"/>
+          <w:szCs w:val="21"/>
+          <w:lang w:val="en-US"/>
+        </w:rPr>
+        <w:t xml:space="preserve"> </w:t>
+      </w:r>
+      <w:r>
+        <w:rPr>
           <w:rFonts w:ascii="Times New Roman" w:hAnsi="Times New Roman" w:eastAsia="宋体" w:cs="Times New Roman"/>
           <w:b/>
           <w:bCs/>
@@ -4809,7 +4821,7 @@
                     </pic:cNvPicPr>
                   </pic:nvPicPr>
                   <pic:blipFill>
-                    <a:blip r:embed="rId24" cstate="print">
+                    <a:blip r:embed="rId26" cstate="print">
                       <a:extLst>
                         <a:ext uri="{28A0092B-C50C-407E-A947-70E740481C1C}">
                           <a14:useLocalDpi xmlns:a14="http://schemas.microsoft.com/office/drawing/2010/main" val="0"/>
@@ -4967,7 +4979,26 @@
           <w:sz w:val="24"/>
           <w:szCs w:val="21"/>
         </w:rPr>
-        <w:t>已有研究证实宫腔粘连（IUA）ARLNC1相关生物标志物与免疫/基质细胞浸润存在显著关联，涉及的细胞类型包括子宫内膜上皮细胞、成纤维细胞、巨噬细胞、T淋巴细胞、树突状细胞、自然杀伤细胞等。为进一步评估基于生物标志物分组的IUA样本在细胞浸润状态上的差异，在训练集（IUA bulk转录组自测序训练集）中，首先采用CIBERSORT算法计算每个样本中22种免疫/基质细胞的相对浸润比例（PMID: 25940772），剔除p＞0.05的低可靠性样本；随后运用Wilcoxon秩和检验对比IUA组和健康对照组间细胞浸润水平差异（p＜0.05），筛选出差异细胞，并通过堆叠图可视化呈现细胞浸润分布特征（Figure 8A-B）。【备注：若CIBERSORT算法分析结果不理想，可替换为xCELL、TIMER、QUANTISEQ或ssGSEA等其他细胞浸润分析算法，具体算法选择依据实际分析结果确定【PMID：32351880、39987127】。</w:t>
+        <w:t>已有研究证实宫腔粘连（IUA）ARLNC1相关生物标志物与免疫/基质细胞浸润存在显著关联，涉及的细胞类型包括子宫内膜上皮细胞、成纤维细胞、巨噬细胞、T淋巴细胞、树突状细胞、自然杀伤细胞等。为进一步评估基于生物标志物分组的IUA样本在细胞浸润状态上的差异，在训练集（IUA bulk转录组自测序训练集）中，</w:t>
+      </w:r>
+      <w:r>
+        <w:rPr>
+          <w:rFonts w:hint="eastAsia" w:ascii="Times New Roman" w:hAnsi="Times New Roman" w:eastAsia="宋体" w:cs="Times New Roman"/>
+          <w:kern w:val="0"/>
+          <w:sz w:val="24"/>
+          <w:szCs w:val="21"/>
+          <w:highlight w:val="yellow"/>
+        </w:rPr>
+        <w:t>首先采用CIBERSORT算法计算每个样本中22种免疫/基质细胞的相对浸润比例（PMID: 25940772），剔除p＞0.05的低可靠性样本；</w:t>
+      </w:r>
+      <w:r>
+        <w:rPr>
+          <w:rFonts w:hint="eastAsia" w:ascii="Times New Roman" w:hAnsi="Times New Roman" w:eastAsia="宋体" w:cs="Times New Roman"/>
+          <w:kern w:val="0"/>
+          <w:sz w:val="24"/>
+          <w:szCs w:val="21"/>
+        </w:rPr>
+        <w:t>随后运用Wilcoxon秩和检验对比IUA组和健康对照组间细胞浸润水平差异（p＜0.05），筛选出差异细胞，并通过堆叠图可视化呈现细胞浸润分布特征（Figure 8A-B）。【备注：若CIBERSORT算法分析结果不理想，可替换为xCELL、TIMER、QUANTISEQ或ssGSEA等其他细胞浸润分析算法，具体算法选择依据实际分析结果确定【PMID：32351880、39987127】。</w:t>
       </w:r>
     </w:p>
     <w:p>
@@ -5057,7 +5088,7 @@
                     </pic:cNvPicPr>
                   </pic:nvPicPr>
                   <pic:blipFill>
-                    <a:blip r:embed="rId25">
+                    <a:blip r:embed="rId27">
                       <a:extLst>
                         <a:ext uri="{28A0092B-C50C-407E-A947-70E740481C1C}">
                           <a14:useLocalDpi xmlns:a14="http://schemas.microsoft.com/office/drawing/2010/main" val="0"/>
@@ -5152,7 +5183,7 @@
                     </pic:cNvPicPr>
                   </pic:nvPicPr>
                   <pic:blipFill>
-                    <a:blip r:embed="rId26">
+                    <a:blip r:embed="rId28">
                       <a:extLst>
                         <a:ext uri="{28A0092B-C50C-407E-A947-70E740481C1C}">
                           <a14:useLocalDpi xmlns:a14="http://schemas.microsoft.com/office/drawing/2010/main" val="0"/>
@@ -5247,7 +5278,7 @@
                     </pic:cNvPicPr>
                   </pic:nvPicPr>
                   <pic:blipFill>
-                    <a:blip r:embed="rId27" cstate="print">
+                    <a:blip r:embed="rId29" cstate="print">
                       <a:extLst>
                         <a:ext uri="{28A0092B-C50C-407E-A947-70E740481C1C}">
                           <a14:useLocalDpi xmlns:a14="http://schemas.microsoft.com/office/drawing/2010/main" val="0"/>
@@ -5342,7 +5373,7 @@
                     </pic:cNvPicPr>
                   </pic:nvPicPr>
                   <pic:blipFill>
-                    <a:blip r:embed="rId28" cstate="print">
+                    <a:blip r:embed="rId30" cstate="print">
                       <a:extLst>
                         <a:ext uri="{28A0092B-C50C-407E-A947-70E740481C1C}">
                           <a14:useLocalDpi xmlns:a14="http://schemas.microsoft.com/office/drawing/2010/main" val="0"/>
@@ -5537,7 +5568,7 @@
                     </pic:cNvPicPr>
                   </pic:nvPicPr>
                   <pic:blipFill>
-                    <a:blip r:embed="rId29" cstate="print">
+                    <a:blip r:embed="rId31" cstate="print">
                       <a:extLst>
                         <a:ext uri="{28A0092B-C50C-407E-A947-70E740481C1C}">
                           <a14:useLocalDpi xmlns:a14="http://schemas.microsoft.com/office/drawing/2010/main" val="0"/>
@@ -5616,8 +5647,8 @@
         </w:rPr>
         <w:drawing>
           <wp:inline distT="0" distB="0" distL="0" distR="0">
-            <wp:extent cx="1698625" cy="1450975"/>
-            <wp:effectExtent l="0" t="0" r="8255" b="12065"/>
+            <wp:extent cx="1549400" cy="1323340"/>
+            <wp:effectExtent l="0" t="0" r="12700" b="10160"/>
             <wp:docPr id="335350041" name="图片 4"/>
             <wp:cNvGraphicFramePr>
               <a:graphicFrameLocks xmlns:a="http://schemas.openxmlformats.org/drawingml/2006/main" noChangeAspect="1"/>
@@ -5632,7 +5663,7 @@
                     </pic:cNvPicPr>
                   </pic:nvPicPr>
                   <pic:blipFill>
-                    <a:blip r:embed="rId30">
+                    <a:blip r:embed="rId32">
                       <a:extLst>
                         <a:ext uri="{28A0092B-C50C-407E-A947-70E740481C1C}">
                           <a14:useLocalDpi xmlns:a14="http://schemas.microsoft.com/office/drawing/2010/main" val="0"/>
@@ -5647,7 +5678,7 @@
                   <pic:spPr>
                     <a:xfrm>
                       <a:off x="0" y="0"/>
-                      <a:ext cx="1700651" cy="1452595"/>
+                      <a:ext cx="1549400" cy="1323340"/>
                     </a:xfrm>
                     <a:prstGeom prst="rect">
                       <a:avLst/>
@@ -5727,7 +5758,7 @@
                     </pic:cNvPicPr>
                   </pic:nvPicPr>
                   <pic:blipFill>
-                    <a:blip r:embed="rId31">
+                    <a:blip r:embed="rId33">
                       <a:extLst>
                         <a:ext uri="{28A0092B-C50C-407E-A947-70E740481C1C}">
                           <a14:useLocalDpi xmlns:a14="http://schemas.microsoft.com/office/drawing/2010/main" val="0"/>
@@ -5822,7 +5853,7 @@
                     </pic:cNvPicPr>
                   </pic:nvPicPr>
                   <pic:blipFill>
-                    <a:blip r:embed="rId32">
+                    <a:blip r:embed="rId34">
                       <a:extLst>
                         <a:ext uri="{28A0092B-C50C-407E-A947-70E740481C1C}">
                           <a14:useLocalDpi xmlns:a14="http://schemas.microsoft.com/office/drawing/2010/main" val="0"/>
@@ -6219,7 +6250,7 @@
                     </pic:cNvPicPr>
                   </pic:nvPicPr>
                   <pic:blipFill>
-                    <a:blip r:embed="rId33"/>
+                    <a:blip r:embed="rId35"/>
                     <a:stretch>
                       <a:fillRect/>
                     </a:stretch>
@@ -6316,7 +6347,7 @@
                     </pic:cNvPicPr>
                   </pic:nvPicPr>
                   <pic:blipFill>
-                    <a:blip r:embed="rId34">
+                    <a:blip r:embed="rId36">
                       <a:extLst>
                         <a:ext uri="{28A0092B-C50C-407E-A947-70E740481C1C}">
                           <a14:useLocalDpi xmlns:a14="http://schemas.microsoft.com/office/drawing/2010/main" val="0"/>
@@ -6847,7 +6878,7 @@
                     </pic:cNvPicPr>
                   </pic:nvPicPr>
                   <pic:blipFill>
-                    <a:blip r:embed="rId35" cstate="print">
+                    <a:blip r:embed="rId37" cstate="print">
                       <a:extLst>
                         <a:ext uri="{28A0092B-C50C-407E-A947-70E740481C1C}">
                           <a14:useLocalDpi xmlns:a14="http://schemas.microsoft.com/office/drawing/2010/main" val="0"/>
@@ -7288,7 +7319,37 @@
           <w:sz w:val="24"/>
           <w:szCs w:val="21"/>
         </w:rPr>
-        <w:t>）对核心候选化合物开展系统性ADMET分析，评估其药代动力学特征（吸收：Caco-2细胞通透性、小肠吸收率；分布：血浆蛋白结合率、血脑屏障穿透性；代谢：CYP450酶抑制/诱导；排泄：肾清除率；毒性：急性毒性、肝毒性、致突变性等），筛选标准：关键毒理学参数无明确毒性预警（如急性毒性LD50＞1000 mg/kg、无CYP450 强抑制、无肝毒性/致突变性），药代动力学参数符合体内有效作用特征（如小肠吸收率＞30%、血浆蛋白结合率30%-90%）【PMID：33893803】。利用SwissADME平台（</w:t>
+        <w:t>）对核心候选化合物开展系统性ADMET分析，评估其药代动力学特征（吸收：Caco-2细胞通透性、小肠吸收率；分布：血浆蛋白结合率、血脑屏障穿透性；代谢：CYP450酶抑制/诱导；排泄：肾清除率；毒性：急性毒性、肝毒性、致突变性等），筛选标准：关键毒理学参数无明确毒性预警（</w:t>
+      </w:r>
+      <w:r>
+        <w:rPr>
+          <w:rFonts w:hint="eastAsia" w:ascii="Times New Roman" w:hAnsi="Times New Roman" w:eastAsia="宋体" w:cs="Times New Roman"/>
+          <w:kern w:val="0"/>
+          <w:sz w:val="24"/>
+          <w:szCs w:val="21"/>
+          <w:highlight w:val="yellow"/>
+        </w:rPr>
+        <w:t>如急性毒性LD50＞1000 mg/kg、无CYP450 强抑制、无肝毒性/致突变性），药代动力学参数符合体内有效作用特征（如小肠吸收率＞30%、血浆蛋白结合率30%-90%）【PMID：33893803】</w:t>
+      </w:r>
+      <w:r>
+        <w:rPr>
+          <w:rFonts w:hint="eastAsia" w:ascii="Times New Roman" w:hAnsi="Times New Roman" w:eastAsia="宋体" w:cs="Times New Roman"/>
+          <w:kern w:val="0"/>
+          <w:sz w:val="24"/>
+          <w:szCs w:val="21"/>
+        </w:rPr>
+        <w:t>。利用</w:t>
+      </w:r>
+      <w:bookmarkStart w:id="4" w:name="_GoBack"/>
+      <w:bookmarkEnd w:id="4"/>
+      <w:r>
+        <w:rPr>
+          <w:rFonts w:hint="eastAsia" w:ascii="Times New Roman" w:hAnsi="Times New Roman" w:eastAsia="宋体" w:cs="Times New Roman"/>
+          <w:kern w:val="0"/>
+          <w:sz w:val="24"/>
+          <w:szCs w:val="21"/>
+        </w:rPr>
+        <w:t>SwissADME平台（</w:t>
       </w:r>
       <w:r>
         <w:rPr>
@@ -7421,7 +7482,7 @@
                     </pic:cNvPicPr>
                   </pic:nvPicPr>
                   <pic:blipFill>
-                    <a:blip r:embed="rId36">
+                    <a:blip r:embed="rId38">
                       <a:extLst>
                         <a:ext uri="{28A0092B-C50C-407E-A947-70E740481C1C}">
                           <a14:useLocalDpi xmlns:a14="http://schemas.microsoft.com/office/drawing/2010/main" val="0"/>
@@ -7531,7 +7592,7 @@
                     </pic:cNvPicPr>
                   </pic:nvPicPr>
                   <pic:blipFill>
-                    <a:blip r:embed="rId37">
+                    <a:blip r:embed="rId39">
                       <a:extLst>
                         <a:ext uri="{28A0092B-C50C-407E-A947-70E740481C1C}">
                           <a14:useLocalDpi xmlns:a14="http://schemas.microsoft.com/office/drawing/2010/main" val="0"/>
@@ -7656,7 +7717,7 @@
                     </pic:cNvPicPr>
                   </pic:nvPicPr>
                   <pic:blipFill>
-                    <a:blip r:embed="rId38" cstate="print">
+                    <a:blip r:embed="rId40" cstate="print">
                       <a:extLst>
                         <a:ext uri="{28A0092B-C50C-407E-A947-70E740481C1C}">
                           <a14:useLocalDpi xmlns:a14="http://schemas.microsoft.com/office/drawing/2010/main" val="0"/>
@@ -7946,7 +8007,7 @@
                     </pic:cNvPicPr>
                   </pic:nvPicPr>
                   <pic:blipFill>
-                    <a:blip r:embed="rId39">
+                    <a:blip r:embed="rId41">
                       <a:extLst>
                         <a:ext uri="{28A0092B-C50C-407E-A947-70E740481C1C}">
                           <a14:useLocalDpi xmlns:a14="http://schemas.microsoft.com/office/drawing/2010/main" val="0"/>
@@ -8181,7 +8242,7 @@
                     </pic:cNvPicPr>
                   </pic:nvPicPr>
                   <pic:blipFill>
-                    <a:blip r:embed="rId40" cstate="print">
+                    <a:blip r:embed="rId42" cstate="print">
                       <a:extLst>
                         <a:ext uri="{28A0092B-C50C-407E-A947-70E740481C1C}">
                           <a14:useLocalDpi xmlns:a14="http://schemas.microsoft.com/office/drawing/2010/main" val="0"/>
@@ -8349,7 +8410,7 @@
                     </pic:cNvPicPr>
                   </pic:nvPicPr>
                   <pic:blipFill>
-                    <a:blip r:embed="rId41">
+                    <a:blip r:embed="rId43">
                       <a:extLst>
                         <a:ext uri="{28A0092B-C50C-407E-A947-70E740481C1C}">
                           <a14:useLocalDpi xmlns:a14="http://schemas.microsoft.com/office/drawing/2010/main" val="0"/>
@@ -8526,7 +8587,7 @@
                     </pic:cNvPicPr>
                   </pic:nvPicPr>
                   <pic:blipFill>
-                    <a:blip r:embed="rId42" cstate="print">
+                    <a:blip r:embed="rId44" cstate="print">
                       <a:extLst>
                         <a:ext uri="{28A0092B-C50C-407E-A947-70E740481C1C}">
                           <a14:useLocalDpi xmlns:a14="http://schemas.microsoft.com/office/drawing/2010/main" val="0"/>
@@ -8591,7 +8652,7 @@
                     </pic:cNvPicPr>
                   </pic:nvPicPr>
                   <pic:blipFill>
-                    <a:blip r:embed="rId43" cstate="print">
+                    <a:blip r:embed="rId45" cstate="print">
                       <a:extLst>
                         <a:ext uri="{28A0092B-C50C-407E-A947-70E740481C1C}">
                           <a14:useLocalDpi xmlns:a14="http://schemas.microsoft.com/office/drawing/2010/main" val="0"/>
@@ -8753,7 +8814,7 @@
                     </pic:cNvPicPr>
                   </pic:nvPicPr>
                   <pic:blipFill>
-                    <a:blip r:embed="rId44"/>
+                    <a:blip r:embed="rId46"/>
                     <a:stretch>
                       <a:fillRect/>
                     </a:stretch>
@@ -8972,7 +9033,7 @@
                     </pic:cNvPicPr>
                   </pic:nvPicPr>
                   <pic:blipFill>
-                    <a:blip r:embed="rId45" cstate="print">
+                    <a:blip r:embed="rId47" cstate="print">
                       <a:extLst>
                         <a:ext uri="{28A0092B-C50C-407E-A947-70E740481C1C}">
                           <a14:useLocalDpi xmlns:a14="http://schemas.microsoft.com/office/drawing/2010/main" val="0"/>
@@ -9056,7 +9117,7 @@
                     </pic:cNvPicPr>
                   </pic:nvPicPr>
                   <pic:blipFill>
-                    <a:blip r:embed="rId46">
+                    <a:blip r:embed="rId48">
                       <a:extLst>
                         <a:ext uri="{28A0092B-C50C-407E-A947-70E740481C1C}">
                           <a14:useLocalDpi xmlns:a14="http://schemas.microsoft.com/office/drawing/2010/main" val="0"/>
@@ -9214,7 +9275,7 @@
                     </pic:cNvPicPr>
                   </pic:nvPicPr>
                   <pic:blipFill>
-                    <a:blip r:embed="rId47">
+                    <a:blip r:embed="rId49">
                       <a:extLst>
                         <a:ext uri="{28A0092B-C50C-407E-A947-70E740481C1C}">
                           <a14:useLocalDpi xmlns:a14="http://schemas.microsoft.com/office/drawing/2010/main" val="0"/>
@@ -9659,7 +9720,7 @@
                     </pic:cNvPicPr>
                   </pic:nvPicPr>
                   <pic:blipFill>
-                    <a:blip r:embed="rId48" cstate="print">
+                    <a:blip r:embed="rId50" cstate="print">
                       <a:extLst>
                         <a:ext uri="{28A0092B-C50C-407E-A947-70E740481C1C}">
                           <a14:useLocalDpi xmlns:a14="http://schemas.microsoft.com/office/drawing/2010/main" val="0"/>
@@ -9754,7 +9815,7 @@
                     </pic:cNvPicPr>
                   </pic:nvPicPr>
                   <pic:blipFill>
-                    <a:blip r:embed="rId49" cstate="print">
+                    <a:blip r:embed="rId51" cstate="print">
                       <a:extLst>
                         <a:ext uri="{28A0092B-C50C-407E-A947-70E740481C1C}">
                           <a14:useLocalDpi xmlns:a14="http://schemas.microsoft.com/office/drawing/2010/main" val="0"/>
@@ -9817,7 +9878,7 @@
           <w:numId w:val="3"/>
         </w:numPr>
         <w:spacing w:after="160" w:line="360" w:lineRule="auto"/>
-        <w:ind w:left="842" w:hanging="360" w:firstLineChars="0"/>
+        <w:ind w:left="840" w:leftChars="0" w:hanging="360" w:firstLineChars="0"/>
         <w:outlineLvl w:val="1"/>
         <w:rPr>
           <w:rFonts w:ascii="Times New Roman" w:hAnsi="Times New Roman" w:eastAsia="宋体" w:cs="Times New Roman"/>
@@ -9923,7 +9984,7 @@
                     </pic:cNvPicPr>
                   </pic:nvPicPr>
                   <pic:blipFill>
-                    <a:blip r:embed="rId50">
+                    <a:blip r:embed="rId52">
                       <a:extLst>
                         <a:ext uri="{28A0092B-C50C-407E-A947-70E740481C1C}">
                           <a14:useLocalDpi xmlns:a14="http://schemas.microsoft.com/office/drawing/2010/main" val="0"/>
@@ -10021,7 +10082,7 @@
                     </pic:cNvPicPr>
                   </pic:nvPicPr>
                   <pic:blipFill>
-                    <a:blip r:embed="rId51">
+                    <a:blip r:embed="rId53">
                       <a:extLst>
                         <a:ext uri="{28A0092B-C50C-407E-A947-70E740481C1C}">
                           <a14:useLocalDpi xmlns:a14="http://schemas.microsoft.com/office/drawing/2010/main" val="0"/>
@@ -10086,7 +10147,7 @@
           <w:numId w:val="3"/>
         </w:numPr>
         <w:spacing w:after="160" w:line="360" w:lineRule="auto"/>
-        <w:ind w:left="842" w:hanging="360" w:firstLineChars="0"/>
+        <w:ind w:left="840" w:leftChars="0" w:hanging="360" w:firstLineChars="0"/>
         <w:outlineLvl w:val="1"/>
         <w:rPr>
           <w:rFonts w:ascii="Times New Roman" w:hAnsi="Times New Roman" w:eastAsia="宋体" w:cs="Times New Roman"/>
@@ -10207,7 +10268,7 @@
                     </pic:cNvPicPr>
                   </pic:nvPicPr>
                   <pic:blipFill>
-                    <a:blip r:embed="rId52" cstate="print">
+                    <a:blip r:embed="rId54" cstate="print">
                       <a:extLst>
                         <a:ext uri="{28A0092B-C50C-407E-A947-70E740481C1C}">
                           <a14:useLocalDpi xmlns:a14="http://schemas.microsoft.com/office/drawing/2010/main" val="0"/>
@@ -10270,16 +10331,18 @@
           <w:numId w:val="3"/>
         </w:numPr>
         <w:spacing w:after="160" w:line="360" w:lineRule="auto"/>
-        <w:ind w:left="842" w:hanging="360" w:firstLineChars="0"/>
+        <w:ind w:left="840" w:leftChars="0" w:hanging="360" w:firstLineChars="0"/>
         <w:rPr>
           <w:rFonts w:ascii="Times New Roman" w:hAnsi="Times New Roman" w:eastAsia="宋体" w:cs="Times New Roman"/>
           <w:kern w:val="44"/>
           <w:sz w:val="24"/>
           <w:szCs w:val="21"/>
+          <w:highlight w:val="yellow"/>
           <w:vertAlign w:val="superscript"/>
           <w:lang w:val="en-US" w:eastAsia="zh-CN" w:bidi="ar-SA"/>
         </w:rPr>
       </w:pPr>
+      <w:commentRangeStart w:id="0"/>
       <w:r>
         <w:rPr>
           <w:rFonts w:ascii="Times New Roman" w:hAnsi="Times New Roman" w:eastAsia="宋体" w:cs="Times New Roman"/>
@@ -10288,6 +10351,7 @@
           <w:color w:val="000000"/>
           <w:sz w:val="24"/>
           <w:szCs w:val="21"/>
+          <w:highlight w:val="yellow"/>
           <w:lang w:val="en-US" w:eastAsia="zh-CN" w:bidi="ar-SA"/>
         </w:rPr>
         <w:t>scTenifoldKnk 虚拟敲除</w:t>
@@ -10298,10 +10362,15 @@
           <w:kern w:val="44"/>
           <w:sz w:val="24"/>
           <w:szCs w:val="21"/>
+          <w:highlight w:val="yellow"/>
           <w:vertAlign w:val="superscript"/>
           <w:lang w:val="en-US" w:eastAsia="zh-CN" w:bidi="ar-SA"/>
         </w:rPr>
         <w:t>PMID: 37246643</w:t>
+      </w:r>
+      <w:commentRangeEnd w:id="0"/>
+      <w:r>
+        <w:commentReference w:id="0"/>
       </w:r>
     </w:p>
     <w:p>
@@ -10391,7 +10460,7 @@
                     <pic:cNvPicPr/>
                   </pic:nvPicPr>
                   <pic:blipFill>
-                    <a:blip r:embed="rId53" cstate="print"/>
+                    <a:blip r:embed="rId55" cstate="print"/>
                     <a:srcRect t="4862"/>
                     <a:stretch>
                       <a:fillRect/>
@@ -10436,7 +10505,7 @@
                     <pic:cNvPicPr/>
                   </pic:nvPicPr>
                   <pic:blipFill>
-                    <a:blip r:embed="rId53" cstate="print"/>
+                    <a:blip r:embed="rId55" cstate="print"/>
                     <a:srcRect t="4420"/>
                     <a:stretch>
                       <a:fillRect/>
@@ -10728,7 +10797,7 @@
                     </pic:cNvPicPr>
                   </pic:nvPicPr>
                   <pic:blipFill>
-                    <a:blip r:embed="rId54">
+                    <a:blip r:embed="rId56">
                       <a:extLst>
                         <a:ext uri="{28A0092B-C50C-407E-A947-70E740481C1C}">
                           <a14:useLocalDpi xmlns:a14="http://schemas.microsoft.com/office/drawing/2010/main" val="0"/>
@@ -12045,12 +12114,10 @@
           </w14:textFill>
         </w:rPr>
       </w:pPr>
-      <w:bookmarkStart w:id="4" w:name="_GoBack"/>
-      <w:bookmarkEnd w:id="4"/>
     </w:p>
     <w:sectPr>
-      <w:headerReference r:id="rId7" w:type="default"/>
-      <w:footerReference r:id="rId8" w:type="default"/>
+      <w:headerReference r:id="rId9" w:type="default"/>
+      <w:footerReference r:id="rId10" w:type="default"/>
       <w:pgSz w:w="11906" w:h="16838"/>
       <w:pgMar w:top="1440" w:right="1800" w:bottom="1440" w:left="1800" w:header="851" w:footer="992" w:gutter="0"/>
       <w:pgNumType w:start="1"/>
@@ -12059,6 +12126,35 @@
     </w:sectPr>
   </w:body>
 </w:document>
+</file>
+
+<file path=word/comments.xml><?xml version="1.0" encoding="utf-8"?>
+<w:comments xmlns:wpc="http://schemas.microsoft.com/office/word/2010/wordprocessingCanvas" xmlns:mc="http://schemas.openxmlformats.org/markup-compatibility/2006" xmlns:o="urn:schemas-microsoft-com:office:office" xmlns:r="http://schemas.openxmlformats.org/officeDocument/2006/relationships" xmlns:m="http://schemas.openxmlformats.org/officeDocument/2006/math" xmlns:v="urn:schemas-microsoft-com:vml" xmlns:wp14="http://schemas.microsoft.com/office/word/2010/wordprocessingDrawing" xmlns:wp="http://schemas.openxmlformats.org/drawingml/2006/wordprocessingDrawing" xmlns:w="http://schemas.openxmlformats.org/wordprocessingml/2006/main" xmlns:w14="http://schemas.microsoft.com/office/word/2010/wordml" xmlns:w15="http://schemas.microsoft.com/office/word/2012/wordml" xmlns:w10="urn:schemas-microsoft-com:office:word" xmlns:wpg="http://schemas.microsoft.com/office/word/2010/wordprocessingGroup" xmlns:wpi="http://schemas.microsoft.com/office/word/2010/wordprocessingInk" xmlns:wne="http://schemas.microsoft.com/office/word/2006/wordml" xmlns:wps="http://schemas.microsoft.com/office/word/2010/wordprocessingShape" xmlns:wpsCustomData="http://www.wps.cn/officeDocument/2013/wpsCustomData" mc:Ignorable="w14 w15 wp14">
+  <w:comment w:id="0" w:author="echo" w:date="2026-03-10T10:58:35Z" w:initials="e">
+    <w:p>
+      <w:pPr>
+        <w:pStyle w:val="6"/>
+        <w:rPr>
+          <w:rFonts w:hint="default"/>
+          <w:lang w:val="en-US"/>
+        </w:rPr>
+      </w:pPr>
+      <w:r>
+        <w:rPr>
+          <w:rFonts w:hint="default"/>
+          <w:lang w:val="en-US"/>
+        </w:rPr>
+        <w:t>by others</w:t>
+      </w:r>
+    </w:p>
+  </w:comment>
+</w:comments>
+</file>
+
+<file path=word/commentsExtended.xml><?xml version="1.0" encoding="utf-8"?>
+<w15:commentsEx xmlns:wpc="http://schemas.microsoft.com/office/word/2010/wordprocessingCanvas" xmlns:mc="http://schemas.openxmlformats.org/markup-compatibility/2006" xmlns:o="urn:schemas-microsoft-com:office:office" xmlns:r="http://schemas.openxmlformats.org/officeDocument/2006/relationships" xmlns:m="http://schemas.openxmlformats.org/officeDocument/2006/math" xmlns:v="urn:schemas-microsoft-com:vml" xmlns:wp14="http://schemas.microsoft.com/office/word/2010/wordprocessingDrawing" xmlns:wp="http://schemas.openxmlformats.org/drawingml/2006/wordprocessingDrawing" xmlns:w="http://schemas.openxmlformats.org/wordprocessingml/2006/main" xmlns:w14="http://schemas.microsoft.com/office/word/2010/wordml" xmlns:w15="http://schemas.microsoft.com/office/word/2012/wordml" xmlns:w10="urn:schemas-microsoft-com:office:word" xmlns:wpg="http://schemas.microsoft.com/office/word/2010/wordprocessingGroup" xmlns:wpi="http://schemas.microsoft.com/office/word/2010/wordprocessingInk" xmlns:wne="http://schemas.microsoft.com/office/word/2006/wordml" xmlns:wps="http://schemas.microsoft.com/office/word/2010/wordprocessingShape" xmlns:wpsCustomData="http://www.wps.cn/officeDocument/2013/wpsCustomData" mc:Ignorable="w14 w15 wp14">
+  <w15:commentEx w15:paraId="1FB121BB" w15:done="0"/>
+</w15:commentsEx>
 </file>
 
 <file path=word/endnotes.xml><?xml version="1.0" encoding="utf-8"?>
@@ -12227,7 +12323,7 @@
       <w:lvlText w:val="%1."/>
       <w:lvlJc w:val="left"/>
       <w:pPr>
-        <w:ind w:left="842" w:hanging="360"/>
+        <w:ind w:left="840" w:hanging="360"/>
       </w:pPr>
       <w:rPr>
         <w:rFonts w:hint="default"/>
@@ -12409,6 +12505,14 @@
     <w:abstractNumId w:val="1"/>
   </w:num>
 </w:numbering>
+</file>
+
+<file path=word/people.xml><?xml version="1.0" encoding="utf-8"?>
+<w15:people xmlns:wpc="http://schemas.microsoft.com/office/word/2010/wordprocessingCanvas" xmlns:mc="http://schemas.openxmlformats.org/markup-compatibility/2006" xmlns:o="urn:schemas-microsoft-com:office:office" xmlns:r="http://schemas.openxmlformats.org/officeDocument/2006/relationships" xmlns:m="http://schemas.openxmlformats.org/officeDocument/2006/math" xmlns:v="urn:schemas-microsoft-com:vml" xmlns:wp14="http://schemas.microsoft.com/office/word/2010/wordprocessingDrawing" xmlns:wp="http://schemas.openxmlformats.org/drawingml/2006/wordprocessingDrawing" xmlns:w="http://schemas.openxmlformats.org/wordprocessingml/2006/main" xmlns:w14="http://schemas.microsoft.com/office/word/2010/wordml" xmlns:w15="http://schemas.microsoft.com/office/word/2012/wordml" xmlns:w10="urn:schemas-microsoft-com:office:word" xmlns:wpg="http://schemas.microsoft.com/office/word/2010/wordprocessingGroup" xmlns:wpi="http://schemas.microsoft.com/office/word/2010/wordprocessingInk" xmlns:wne="http://schemas.microsoft.com/office/word/2006/wordml" xmlns:wps="http://schemas.microsoft.com/office/word/2010/wordprocessingShape" xmlns:wpsCustomData="http://www.wps.cn/officeDocument/2013/wpsCustomData" mc:Ignorable="w14 w15 wp14">
+  <w15:person w15:author="echo">
+    <w15:presenceInfo w15:providerId="None" w15:userId="echo"/>
+  </w15:person>
+</w15:people>
 </file>
 
 <file path=word/styles.xml><?xml version="1.0" encoding="utf-8"?>

</xml_diff>